<commit_message>
Update process document templates
</commit_message>
<xml_diff>
--- a/public/templates/process-docs/主体结构工程分部工程报验申请单.docx
+++ b/public/templates/process-docs/主体结构工程分部工程报验申请单.docx
@@ -78,7 +78,7 @@
           <w:rFonts w:hint="eastAsia" w:ascii="宋体" w:hAnsi="宋体"/>
           <w:szCs w:val="21"/>
         </w:rPr>
-        <w:t>工程名称：中核汇能高明创楷3.58904MWP分布式光伏项目 编号：</w:t>
+        <w:t>工程名称：{{项目名}} 编号：</w:t>
       </w:r>
       <w:r>
         <w:rPr>
@@ -86,7 +86,7 @@
           <w:sz w:val="18"/>
           <w:szCs w:val="18"/>
         </w:rPr>
-        <w:t>5028G01-SG-ZHHC-0</w:t>
+        <w:t>{{文件编号}}</w:t>
       </w:r>
       <w:r>
         <w:rPr>
@@ -179,7 +179,7 @@
                 <w:sz w:val="24"/>
                 <w:u w:val="single"/>
               </w:rPr>
-              <w:t xml:space="preserve">             河南中核五院研究设计有限公司                 </w:t>
+              <w:t xml:space="preserve">             {{监理项目部}}                 </w:t>
             </w:r>
             <w:r>
               <w:rPr>

</xml_diff>